<commit_message>
completed test plan updates
</commit_message>
<xml_diff>
--- a/MODULE-7/7.2 Assignment - Moffat Bay.docx
+++ b/MODULE-7/7.2 Assignment - Moffat Bay.docx
@@ -58,6 +58,15 @@
               </w:rPr>
               <w:t>Moffat Bay Lodge</w:t>
             </w:r>
+            <w:r>
+              <w:rPr>
+                <w:rFonts w:ascii="Arial" w:hAnsi="Arial" w:cs="Arial"/>
+                <w:color w:val="C00000"/>
+                <w:sz w:val="20"/>
+                <w:szCs w:val="20"/>
+              </w:rPr>
+              <w:t xml:space="preserve"> 7.2 Assignment </w:t>
+            </w:r>
           </w:p>
         </w:tc>
         <w:tc>
@@ -210,7 +219,7 @@
                 <w:sz w:val="20"/>
                 <w:szCs w:val="20"/>
               </w:rPr>
-              <w:t xml:space="preserve">&lt;Enter a description&gt; </w:t>
+              <w:t>This test plan verifies the functionality of the About Us page and Reservation Summary page for the Moffat Bay Lodge project. The tests ensure that user session data is displayed correctly, reservation data is processed and stored properly, and that users can successfully complete a reservation and view the confirmation details.</w:t>
             </w:r>
           </w:p>
         </w:tc>
@@ -351,6 +360,8 @@
           <w:b/>
           <w:bCs/>
           <w:noProof/>
+          <w:sz w:val="36"/>
+          <w:szCs w:val="36"/>
         </w:rPr>
       </w:sdtEndPr>
       <w:sdtContent>
@@ -374,261 +385,111 @@
         </w:p>
         <w:p>
           <w:pPr>
-            <w:pStyle w:val="TOC1"/>
-            <w:tabs>
-              <w:tab w:val="right" w:leader="dot" w:pos="12950"/>
-            </w:tabs>
             <w:rPr>
-              <w:rFonts w:eastAsiaTheme="minorEastAsia"/>
-              <w:noProof/>
+              <w:b/>
+              <w:bCs/>
+              <w:sz w:val="36"/>
+              <w:szCs w:val="36"/>
             </w:rPr>
           </w:pPr>
           <w:r>
             <w:rPr>
-              <w:rFonts w:ascii="Arial" w:hAnsi="Arial" w:cs="Arial"/>
+              <w:b/>
+              <w:bCs/>
+              <w:sz w:val="36"/>
+              <w:szCs w:val="36"/>
             </w:rPr>
-            <w:fldChar w:fldCharType="begin"/>
+            <w:t xml:space="preserve">Reservation Flow </w:t>
           </w:r>
           <w:r>
             <w:rPr>
-              <w:rFonts w:ascii="Arial" w:hAnsi="Arial" w:cs="Arial"/>
+              <w:b/>
+              <w:bCs/>
+              <w:sz w:val="36"/>
+              <w:szCs w:val="36"/>
             </w:rPr>
-            <w:instrText xml:space="preserve"> TOC \o "1-3" \h \z \u </w:instrText>
+            <w:t>……………………………………………………………………………………………….2</w:t>
           </w:r>
-          <w:r>
-            <w:rPr>
-              <w:rFonts w:ascii="Arial" w:hAnsi="Arial" w:cs="Arial"/>
-            </w:rPr>
-            <w:fldChar w:fldCharType="separate"/>
-          </w:r>
-          <w:hyperlink w:anchor="_Toc132718195" w:history="1">
-            <w:r>
-              <w:rPr>
-                <w:rStyle w:val="Hyperlink"/>
-                <w:rFonts w:ascii="Arial" w:hAnsi="Arial" w:cs="Arial"/>
-                <w:b/>
-                <w:bCs/>
-                <w:noProof/>
-              </w:rPr>
-              <w:t>&lt;DESCRIPTION&gt;</w:t>
-            </w:r>
-            <w:r>
-              <w:rPr>
-                <w:noProof/>
-                <w:webHidden/>
-              </w:rPr>
-              <w:tab/>
-            </w:r>
-            <w:r>
-              <w:rPr>
-                <w:noProof/>
-                <w:webHidden/>
-              </w:rPr>
-              <w:fldChar w:fldCharType="begin"/>
-            </w:r>
-            <w:r>
-              <w:rPr>
-                <w:noProof/>
-                <w:webHidden/>
-              </w:rPr>
-              <w:instrText xml:space="preserve"> PAGEREF _Toc132718195 \h </w:instrText>
-            </w:r>
-            <w:r>
-              <w:rPr>
-                <w:noProof/>
-                <w:webHidden/>
-              </w:rPr>
-            </w:r>
-            <w:r>
-              <w:rPr>
-                <w:noProof/>
-                <w:webHidden/>
-              </w:rPr>
-              <w:fldChar w:fldCharType="separate"/>
-            </w:r>
-            <w:r>
-              <w:rPr>
-                <w:noProof/>
-                <w:webHidden/>
-              </w:rPr>
-              <w:t>2</w:t>
-            </w:r>
-            <w:r>
-              <w:rPr>
-                <w:noProof/>
-                <w:webHidden/>
-              </w:rPr>
-              <w:fldChar w:fldCharType="end"/>
-            </w:r>
-          </w:hyperlink>
         </w:p>
         <w:p>
           <w:pPr>
-            <w:pStyle w:val="TOC1"/>
-            <w:tabs>
-              <w:tab w:val="right" w:leader="dot" w:pos="12950"/>
-            </w:tabs>
             <w:rPr>
-              <w:rFonts w:eastAsiaTheme="minorEastAsia"/>
-              <w:noProof/>
+              <w:b/>
+              <w:bCs/>
+              <w:sz w:val="36"/>
+              <w:szCs w:val="36"/>
             </w:rPr>
           </w:pPr>
-          <w:hyperlink w:anchor="_Toc132718196" w:history="1">
-            <w:r>
-              <w:rPr>
-                <w:rStyle w:val="Hyperlink"/>
-                <w:rFonts w:ascii="Arial" w:hAnsi="Arial" w:cs="Arial"/>
-                <w:b/>
-                <w:bCs/>
-                <w:noProof/>
-              </w:rPr>
-              <w:t>&lt;DESCRIPTION&gt;</w:t>
-            </w:r>
-            <w:r>
-              <w:rPr>
-                <w:noProof/>
-                <w:webHidden/>
-              </w:rPr>
-              <w:tab/>
-            </w:r>
-            <w:r>
-              <w:rPr>
-                <w:noProof/>
-                <w:webHidden/>
-              </w:rPr>
-              <w:fldChar w:fldCharType="begin"/>
-            </w:r>
-            <w:r>
-              <w:rPr>
-                <w:noProof/>
-                <w:webHidden/>
-              </w:rPr>
-              <w:instrText xml:space="preserve"> PAGEREF _Toc132718196 \h </w:instrText>
-            </w:r>
-            <w:r>
-              <w:rPr>
-                <w:noProof/>
-                <w:webHidden/>
-              </w:rPr>
-            </w:r>
-            <w:r>
-              <w:rPr>
-                <w:noProof/>
-                <w:webHidden/>
-              </w:rPr>
-              <w:fldChar w:fldCharType="separate"/>
-            </w:r>
-            <w:r>
-              <w:rPr>
-                <w:noProof/>
-                <w:webHidden/>
-              </w:rPr>
-              <w:t>2</w:t>
-            </w:r>
-            <w:r>
-              <w:rPr>
-                <w:noProof/>
-                <w:webHidden/>
-              </w:rPr>
-              <w:fldChar w:fldCharType="end"/>
-            </w:r>
-          </w:hyperlink>
+          <w:r>
+            <w:rPr>
+              <w:b/>
+              <w:bCs/>
+              <w:sz w:val="36"/>
+              <w:szCs w:val="36"/>
+            </w:rPr>
+            <w:t>Login Required Reservation…………………………………………………………………………………2</w:t>
+          </w:r>
         </w:p>
         <w:p>
           <w:pPr>
-            <w:pStyle w:val="TOC1"/>
-            <w:tabs>
-              <w:tab w:val="right" w:leader="dot" w:pos="12950"/>
-            </w:tabs>
             <w:rPr>
-              <w:rFonts w:eastAsiaTheme="minorEastAsia"/>
-              <w:noProof/>
+              <w:b/>
+              <w:bCs/>
+              <w:sz w:val="36"/>
+              <w:szCs w:val="36"/>
             </w:rPr>
           </w:pPr>
-          <w:hyperlink w:anchor="_Toc132718197" w:history="1">
-            <w:r>
-              <w:rPr>
-                <w:rStyle w:val="Hyperlink"/>
-                <w:rFonts w:ascii="Arial" w:hAnsi="Arial" w:cs="Arial"/>
-                <w:b/>
-                <w:bCs/>
-                <w:noProof/>
-              </w:rPr>
-              <w:t>&lt;DESCRIPTION&gt;</w:t>
-            </w:r>
-            <w:r>
-              <w:rPr>
-                <w:noProof/>
-                <w:webHidden/>
-              </w:rPr>
-              <w:tab/>
-            </w:r>
-            <w:r>
-              <w:rPr>
-                <w:noProof/>
-                <w:webHidden/>
-              </w:rPr>
-              <w:fldChar w:fldCharType="begin"/>
-            </w:r>
-            <w:r>
-              <w:rPr>
-                <w:noProof/>
-                <w:webHidden/>
-              </w:rPr>
-              <w:instrText xml:space="preserve"> PAGEREF _Toc132718197 \h </w:instrText>
-            </w:r>
-            <w:r>
-              <w:rPr>
-                <w:noProof/>
-                <w:webHidden/>
-              </w:rPr>
-            </w:r>
-            <w:r>
-              <w:rPr>
-                <w:noProof/>
-                <w:webHidden/>
-              </w:rPr>
-              <w:fldChar w:fldCharType="separate"/>
-            </w:r>
-            <w:r>
-              <w:rPr>
-                <w:noProof/>
-                <w:webHidden/>
-              </w:rPr>
-              <w:t>3</w:t>
-            </w:r>
-            <w:r>
-              <w:rPr>
-                <w:noProof/>
-                <w:webHidden/>
-              </w:rPr>
-              <w:fldChar w:fldCharType="end"/>
-            </w:r>
-          </w:hyperlink>
+          <w:r>
+            <w:rPr>
+              <w:b/>
+              <w:bCs/>
+              <w:sz w:val="36"/>
+              <w:szCs w:val="36"/>
+            </w:rPr>
+            <w:t>About Us…………………………………………………………………………………………………………</w:t>
+          </w:r>
+          <w:proofErr w:type="gramStart"/>
+          <w:r>
+            <w:rPr>
+              <w:b/>
+              <w:bCs/>
+              <w:sz w:val="36"/>
+              <w:szCs w:val="36"/>
+            </w:rPr>
+            <w:t>…..</w:t>
+          </w:r>
+          <w:proofErr w:type="gramEnd"/>
+          <w:r>
+            <w:rPr>
+              <w:b/>
+              <w:bCs/>
+              <w:sz w:val="36"/>
+              <w:szCs w:val="36"/>
+            </w:rPr>
+            <w:t>3</w:t>
+          </w:r>
         </w:p>
         <w:p>
+          <w:pPr>
+            <w:rPr>
+              <w:b/>
+              <w:bCs/>
+              <w:sz w:val="36"/>
+              <w:szCs w:val="36"/>
+            </w:rPr>
+          </w:pPr>
           <w:r>
             <w:rPr>
-              <w:rFonts w:ascii="Arial" w:hAnsi="Arial" w:cs="Arial"/>
               <w:b/>
               <w:bCs/>
-              <w:noProof/>
+              <w:sz w:val="36"/>
+              <w:szCs w:val="36"/>
             </w:rPr>
-            <w:fldChar w:fldCharType="end"/>
+            <w:t>Reservation Summary Accuracy………………………………………………………………………….4</w:t>
           </w:r>
         </w:p>
       </w:sdtContent>
     </w:sdt>
-    <w:p>
-      <w:pPr>
-        <w:pStyle w:val="NoSpacing"/>
-        <w:rPr>
-          <w:rFonts w:ascii="Arial" w:hAnsi="Arial" w:cs="Arial"/>
-          <w:sz w:val="24"/>
-          <w:szCs w:val="24"/>
-        </w:rPr>
-      </w:pPr>
-    </w:p>
     <w:p>
       <w:pPr>
         <w:pStyle w:val="NoSpacing"/>
@@ -815,7 +676,6 @@
                 <w:sz w:val="24"/>
                 <w:szCs w:val="24"/>
               </w:rPr>
-              <w:lastRenderedPageBreak/>
               <w:t>Test 1</w:t>
             </w:r>
           </w:p>
@@ -834,7 +694,6 @@
                 <w:bCs/>
               </w:rPr>
             </w:pPr>
-            <w:bookmarkStart w:id="0" w:name="_Toc132718195"/>
             <w:r>
               <w:rPr>
                 <w:rFonts w:ascii="Arial" w:hAnsi="Arial" w:cs="Arial"/>
@@ -842,9 +701,8 @@
                 <w:bCs/>
                 <w:color w:val="auto"/>
               </w:rPr>
-              <w:t>&lt;DESCRIPTION&gt;</w:t>
-            </w:r>
-            <w:bookmarkEnd w:id="0"/>
+              <w:t>Reservation Flow</w:t>
+            </w:r>
           </w:p>
         </w:tc>
       </w:tr>
@@ -907,7 +765,7 @@
                 <w:sz w:val="20"/>
                 <w:szCs w:val="20"/>
               </w:rPr>
-              <w:t xml:space="preserve">Verifies input data meets requirements </w:t>
+              <w:t>Verify that a user can successfully create a reservation and view the correct summary details.</w:t>
             </w:r>
           </w:p>
         </w:tc>
@@ -925,6 +783,8 @@
                 <w:szCs w:val="20"/>
               </w:rPr>
             </w:pPr>
+            <w:proofErr w:type="spellStart"/>
+            <w:proofErr w:type="gramStart"/>
             <w:r>
               <w:rPr>
                 <w:rFonts w:ascii="Arial" w:hAnsi="Arial" w:cs="Arial"/>
@@ -935,6 +795,28 @@
               </w:rPr>
               <w:t>Developer:</w:t>
             </w:r>
+            <w:r>
+              <w:rPr>
+                <w:rFonts w:ascii="Arial" w:hAnsi="Arial" w:cs="Arial"/>
+                <w:b/>
+                <w:bCs/>
+                <w:sz w:val="20"/>
+                <w:szCs w:val="20"/>
+              </w:rPr>
+              <w:t>Angela</w:t>
+            </w:r>
+            <w:proofErr w:type="spellEnd"/>
+            <w:proofErr w:type="gramEnd"/>
+            <w:r>
+              <w:rPr>
+                <w:rFonts w:ascii="Arial" w:hAnsi="Arial" w:cs="Arial"/>
+                <w:b/>
+                <w:bCs/>
+                <w:sz w:val="20"/>
+                <w:szCs w:val="20"/>
+              </w:rPr>
+              <w:t xml:space="preserve"> Vargas</w:t>
+            </w:r>
           </w:p>
           <w:p>
             <w:pPr>
@@ -969,27 +851,16 @@
                 <w:sz w:val="20"/>
                 <w:szCs w:val="20"/>
               </w:rPr>
-              <w:t>&lt;</w:t>
-            </w:r>
-            <w:proofErr w:type="spellStart"/>
-            <w:r>
-              <w:rPr>
-                <w:rFonts w:ascii="Arial" w:hAnsi="Arial" w:cs="Arial"/>
-                <w:color w:val="C00000"/>
-                <w:sz w:val="20"/>
-                <w:szCs w:val="20"/>
-              </w:rPr>
-              <w:t>yyyy</w:t>
-            </w:r>
-            <w:proofErr w:type="spellEnd"/>
-            <w:r>
-              <w:rPr>
-                <w:rFonts w:ascii="Arial" w:hAnsi="Arial" w:cs="Arial"/>
-                <w:color w:val="C00000"/>
-                <w:sz w:val="20"/>
-                <w:szCs w:val="20"/>
-              </w:rPr>
-              <w:t xml:space="preserve">/mm/dd&gt; </w:t>
+              <w:t>04/25/2026</w:t>
+            </w:r>
+            <w:r>
+              <w:rPr>
+                <w:rFonts w:ascii="Arial" w:hAnsi="Arial" w:cs="Arial"/>
+                <w:color w:val="C00000"/>
+                <w:sz w:val="20"/>
+                <w:szCs w:val="20"/>
+              </w:rPr>
+              <w:t xml:space="preserve"> </w:t>
             </w:r>
           </w:p>
         </w:tc>
@@ -1287,7 +1158,7 @@
                 <w:sz w:val="20"/>
                 <w:szCs w:val="20"/>
               </w:rPr>
-              <w:t>&lt;Enter an action&gt;</w:t>
+              <w:t>Navigate to login page and enter valid credentials</w:t>
             </w:r>
           </w:p>
         </w:tc>
@@ -1312,7 +1183,7 @@
                 <w:sz w:val="20"/>
                 <w:szCs w:val="20"/>
               </w:rPr>
-              <w:t>&lt;Enter the expected results&gt;</w:t>
+              <w:t>User logs in successfully and is redirected to homepage</w:t>
             </w:r>
           </w:p>
         </w:tc>
@@ -1337,7 +1208,7 @@
                 <w:sz w:val="20"/>
                 <w:szCs w:val="20"/>
               </w:rPr>
-              <w:t>&lt;yes/no&gt;</w:t>
+              <w:t>Pass</w:t>
             </w:r>
           </w:p>
         </w:tc>
@@ -1415,7 +1286,7 @@
                 <w:sz w:val="20"/>
                 <w:szCs w:val="20"/>
               </w:rPr>
-              <w:t>&lt;Enter an action&gt;</w:t>
+              <w:t>Navigate to reservation page</w:t>
             </w:r>
           </w:p>
         </w:tc>
@@ -1440,7 +1311,7 @@
                 <w:sz w:val="20"/>
                 <w:szCs w:val="20"/>
               </w:rPr>
-              <w:t>&lt;Enter the expected results&gt;</w:t>
+              <w:t>Reservation form loads with room and attraction options</w:t>
             </w:r>
           </w:p>
         </w:tc>
@@ -1465,7 +1336,7 @@
                 <w:sz w:val="20"/>
                 <w:szCs w:val="20"/>
               </w:rPr>
-              <w:t>&lt;yes/no&gt;</w:t>
+              <w:t>Pass</w:t>
             </w:r>
           </w:p>
         </w:tc>
@@ -1543,7 +1414,7 @@
                 <w:sz w:val="20"/>
                 <w:szCs w:val="20"/>
               </w:rPr>
-              <w:t>&lt;Enter an action&gt;</w:t>
+              <w:t>Fill out reservation form with valid data and submit</w:t>
             </w:r>
           </w:p>
         </w:tc>
@@ -1568,7 +1439,7 @@
                 <w:sz w:val="20"/>
                 <w:szCs w:val="20"/>
               </w:rPr>
-              <w:t>&lt;Enter the expected results&gt;</w:t>
+              <w:t>Reservation is saved to database and no errors occur</w:t>
             </w:r>
           </w:p>
         </w:tc>
@@ -1593,7 +1464,7 @@
                 <w:sz w:val="20"/>
                 <w:szCs w:val="20"/>
               </w:rPr>
-              <w:t>&lt;yes/no&gt;</w:t>
+              <w:t>Pass</w:t>
             </w:r>
           </w:p>
         </w:tc>
@@ -1671,7 +1542,7 @@
                 <w:sz w:val="20"/>
                 <w:szCs w:val="20"/>
               </w:rPr>
-              <w:t>&lt;Enter an action&gt;</w:t>
+              <w:t>Redirect to reservation summary page</w:t>
             </w:r>
           </w:p>
         </w:tc>
@@ -1696,7 +1567,7 @@
                 <w:sz w:val="20"/>
                 <w:szCs w:val="20"/>
               </w:rPr>
-              <w:t>&lt;Enter the expected results&gt;</w:t>
+              <w:t>Summary page loads automatically</w:t>
             </w:r>
           </w:p>
         </w:tc>
@@ -1721,7 +1592,7 @@
                 <w:sz w:val="20"/>
                 <w:szCs w:val="20"/>
               </w:rPr>
-              <w:t>&lt;yes/no&gt;</w:t>
+              <w:t>Pass</w:t>
             </w:r>
           </w:p>
         </w:tc>
@@ -1799,7 +1670,7 @@
                 <w:sz w:val="20"/>
                 <w:szCs w:val="20"/>
               </w:rPr>
-              <w:t>&lt;Enter an action&gt;</w:t>
+              <w:t>Review reservation details</w:t>
             </w:r>
           </w:p>
         </w:tc>
@@ -1824,7 +1695,7 @@
                 <w:sz w:val="20"/>
                 <w:szCs w:val="20"/>
               </w:rPr>
-              <w:t>&lt;Enter the expected results&gt;</w:t>
+              <w:t>Correct reservation ID, dates, room, guests, attractions, and total cost are displayed</w:t>
             </w:r>
           </w:p>
         </w:tc>
@@ -1849,7 +1720,7 @@
                 <w:sz w:val="20"/>
                 <w:szCs w:val="20"/>
               </w:rPr>
-              <w:t>&lt;yes/no&gt;</w:t>
+              <w:t>Pass</w:t>
             </w:r>
           </w:p>
         </w:tc>
@@ -1932,7 +1803,7 @@
                 <w:sz w:val="20"/>
                 <w:szCs w:val="20"/>
               </w:rPr>
-              <w:t xml:space="preserve">Comments should be substantive; this means there should be at least 2-3 well-structured sentences with constructive feedback. </w:t>
+              <w:t>The reservation process functioned correctly from start to finish. All data entered by the user was properly stored and displayed on the reservation summary page.</w:t>
             </w:r>
           </w:p>
         </w:tc>
@@ -2011,7 +1882,6 @@
                 <w:bCs/>
               </w:rPr>
             </w:pPr>
-            <w:bookmarkStart w:id="1" w:name="_Toc132718196"/>
             <w:r>
               <w:rPr>
                 <w:rFonts w:ascii="Arial" w:hAnsi="Arial" w:cs="Arial"/>
@@ -2019,9 +1889,8 @@
                 <w:bCs/>
                 <w:color w:val="auto"/>
               </w:rPr>
-              <w:t>&lt;DESCRIPTION&gt;</w:t>
-            </w:r>
-            <w:bookmarkEnd w:id="1"/>
+              <w:t>Login Required for Reservation</w:t>
+            </w:r>
           </w:p>
         </w:tc>
       </w:tr>
@@ -2077,6 +1946,16 @@
               </w:rPr>
               <w:t xml:space="preserve">: </w:t>
             </w:r>
+            <w:r>
+              <w:rPr>
+                <w:rFonts w:ascii="Arial" w:hAnsi="Arial" w:cs="Arial"/>
+                <w:b/>
+                <w:bCs/>
+                <w:sz w:val="20"/>
+                <w:szCs w:val="20"/>
+              </w:rPr>
+              <w:t>Test that users must be logged in to access reservation page.</w:t>
+            </w:r>
           </w:p>
         </w:tc>
         <w:tc>
@@ -2093,6 +1972,8 @@
                 <w:szCs w:val="20"/>
               </w:rPr>
             </w:pPr>
+            <w:proofErr w:type="spellStart"/>
+            <w:proofErr w:type="gramStart"/>
             <w:r>
               <w:rPr>
                 <w:rFonts w:ascii="Arial" w:hAnsi="Arial" w:cs="Arial"/>
@@ -2103,6 +1984,28 @@
               </w:rPr>
               <w:t>Developer:</w:t>
             </w:r>
+            <w:r>
+              <w:rPr>
+                <w:rFonts w:ascii="Arial" w:hAnsi="Arial" w:cs="Arial"/>
+                <w:b/>
+                <w:bCs/>
+                <w:sz w:val="20"/>
+                <w:szCs w:val="20"/>
+              </w:rPr>
+              <w:t>Angela</w:t>
+            </w:r>
+            <w:proofErr w:type="spellEnd"/>
+            <w:proofErr w:type="gramEnd"/>
+            <w:r>
+              <w:rPr>
+                <w:rFonts w:ascii="Arial" w:hAnsi="Arial" w:cs="Arial"/>
+                <w:b/>
+                <w:bCs/>
+                <w:sz w:val="20"/>
+                <w:szCs w:val="20"/>
+              </w:rPr>
+              <w:t xml:space="preserve"> Vargas</w:t>
+            </w:r>
           </w:p>
           <w:p>
             <w:pPr>
@@ -2137,27 +2040,16 @@
                 <w:sz w:val="20"/>
                 <w:szCs w:val="20"/>
               </w:rPr>
-              <w:t>&lt;</w:t>
-            </w:r>
-            <w:proofErr w:type="spellStart"/>
-            <w:r>
-              <w:rPr>
-                <w:rFonts w:ascii="Arial" w:hAnsi="Arial" w:cs="Arial"/>
-                <w:color w:val="C00000"/>
-                <w:sz w:val="20"/>
-                <w:szCs w:val="20"/>
-              </w:rPr>
-              <w:t>yyyy</w:t>
-            </w:r>
-            <w:proofErr w:type="spellEnd"/>
-            <w:r>
-              <w:rPr>
-                <w:rFonts w:ascii="Arial" w:hAnsi="Arial" w:cs="Arial"/>
-                <w:color w:val="C00000"/>
-                <w:sz w:val="20"/>
-                <w:szCs w:val="20"/>
-              </w:rPr>
-              <w:t xml:space="preserve">/mm/dd&gt; </w:t>
+              <w:t>04/25/2026</w:t>
+            </w:r>
+            <w:r>
+              <w:rPr>
+                <w:rFonts w:ascii="Arial" w:hAnsi="Arial" w:cs="Arial"/>
+                <w:color w:val="C00000"/>
+                <w:sz w:val="20"/>
+                <w:szCs w:val="20"/>
+              </w:rPr>
+              <w:t xml:space="preserve"> </w:t>
             </w:r>
           </w:p>
         </w:tc>
@@ -2433,7 +2325,7 @@
                 <w:sz w:val="20"/>
                 <w:szCs w:val="20"/>
               </w:rPr>
-              <w:t>&lt;Enter an action&gt;</w:t>
+              <w:t>Open reservation page without logging in</w:t>
             </w:r>
           </w:p>
         </w:tc>
@@ -2458,7 +2350,7 @@
                 <w:sz w:val="20"/>
                 <w:szCs w:val="20"/>
               </w:rPr>
-              <w:t>&lt;Enter the expected results&gt;</w:t>
+              <w:t>User is redirected to login page</w:t>
             </w:r>
           </w:p>
         </w:tc>
@@ -2483,7 +2375,7 @@
                 <w:sz w:val="20"/>
                 <w:szCs w:val="20"/>
               </w:rPr>
-              <w:t>&lt;yes/no&gt;</w:t>
+              <w:t>Pass</w:t>
             </w:r>
           </w:p>
         </w:tc>
@@ -2561,7 +2453,7 @@
                 <w:sz w:val="20"/>
                 <w:szCs w:val="20"/>
               </w:rPr>
-              <w:t>&lt;Enter an action&gt;</w:t>
+              <w:t>Attempt to access reservation page directly via URL</w:t>
             </w:r>
           </w:p>
         </w:tc>
@@ -2586,7 +2478,7 @@
                 <w:sz w:val="20"/>
                 <w:szCs w:val="20"/>
               </w:rPr>
-              <w:t>&lt;Enter the expected results&gt;</w:t>
+              <w:t>Redirect to login page occurs</w:t>
             </w:r>
           </w:p>
         </w:tc>
@@ -2611,7 +2503,7 @@
                 <w:sz w:val="20"/>
                 <w:szCs w:val="20"/>
               </w:rPr>
-              <w:t>&lt;yes/no&gt;</w:t>
+              <w:t>Pass</w:t>
             </w:r>
           </w:p>
         </w:tc>
@@ -2689,7 +2581,7 @@
                 <w:sz w:val="20"/>
                 <w:szCs w:val="20"/>
               </w:rPr>
-              <w:t>&lt;Enter an action&gt;</w:t>
+              <w:t>Log in with valid credentials</w:t>
             </w:r>
           </w:p>
         </w:tc>
@@ -2714,7 +2606,7 @@
                 <w:sz w:val="20"/>
                 <w:szCs w:val="20"/>
               </w:rPr>
-              <w:t>&lt;Enter the expected results&gt;</w:t>
+              <w:t>Login successful</w:t>
             </w:r>
           </w:p>
         </w:tc>
@@ -2739,7 +2631,7 @@
                 <w:sz w:val="20"/>
                 <w:szCs w:val="20"/>
               </w:rPr>
-              <w:t>&lt;yes/no&gt;</w:t>
+              <w:t>Pass</w:t>
             </w:r>
           </w:p>
         </w:tc>
@@ -2817,7 +2709,7 @@
                 <w:sz w:val="20"/>
                 <w:szCs w:val="20"/>
               </w:rPr>
-              <w:t>&lt;Enter an action&gt;</w:t>
+              <w:t>Navigate back to reservation page</w:t>
             </w:r>
           </w:p>
         </w:tc>
@@ -2842,7 +2734,7 @@
                 <w:sz w:val="20"/>
                 <w:szCs w:val="20"/>
               </w:rPr>
-              <w:t>&lt;Enter the expected results&gt;</w:t>
+              <w:t>Reservation page loads successfully</w:t>
             </w:r>
           </w:p>
         </w:tc>
@@ -2867,7 +2759,7 @@
                 <w:sz w:val="20"/>
                 <w:szCs w:val="20"/>
               </w:rPr>
-              <w:t>&lt;yes/no&gt;</w:t>
+              <w:t>Pass</w:t>
             </w:r>
           </w:p>
         </w:tc>
@@ -2920,7 +2812,6 @@
                 <w:sz w:val="20"/>
                 <w:szCs w:val="20"/>
               </w:rPr>
-              <w:lastRenderedPageBreak/>
               <w:t>5</w:t>
             </w:r>
           </w:p>
@@ -2946,7 +2837,7 @@
                 <w:sz w:val="20"/>
                 <w:szCs w:val="20"/>
               </w:rPr>
-              <w:t>&lt;Enter an action&gt;</w:t>
+              <w:t>Verify session is active</w:t>
             </w:r>
           </w:p>
         </w:tc>
@@ -2971,7 +2862,16 @@
                 <w:sz w:val="20"/>
                 <w:szCs w:val="20"/>
               </w:rPr>
-              <w:t>&lt;Enter the expected results&gt;</w:t>
+              <w:t>Username</w:t>
+            </w:r>
+            <w:r>
+              <w:rPr>
+                <w:rFonts w:ascii="Arial" w:hAnsi="Arial" w:cs="Arial"/>
+                <w:color w:val="C00000"/>
+                <w:sz w:val="20"/>
+                <w:szCs w:val="20"/>
+              </w:rPr>
+              <w:t xml:space="preserve"> appears in navigation bar</w:t>
             </w:r>
           </w:p>
         </w:tc>
@@ -2996,7 +2896,7 @@
                 <w:sz w:val="20"/>
                 <w:szCs w:val="20"/>
               </w:rPr>
-              <w:t>&lt;yes/no&gt;</w:t>
+              <w:t>Pass</w:t>
             </w:r>
           </w:p>
         </w:tc>
@@ -3079,7 +2979,7 @@
                 <w:sz w:val="20"/>
                 <w:szCs w:val="20"/>
               </w:rPr>
-              <w:t>Comments should be substantive; this means there should be at least 2-3 well-structured sentences with constructive feedback.</w:t>
+              <w:t>The system correctly restricts access to the reservation page when a user is not logged in. The redirect functionality ensures that only authenticated users can make reservations. After logging in, access is properly granted and session data is maintained across pages.</w:t>
             </w:r>
           </w:p>
         </w:tc>
@@ -3158,7 +3058,6 @@
                 <w:bCs/>
               </w:rPr>
             </w:pPr>
-            <w:bookmarkStart w:id="2" w:name="_Toc132718197"/>
             <w:r>
               <w:rPr>
                 <w:rFonts w:ascii="Arial" w:hAnsi="Arial" w:cs="Arial"/>
@@ -3166,9 +3065,8 @@
                 <w:bCs/>
                 <w:color w:val="auto"/>
               </w:rPr>
-              <w:t>&lt;DESCRIPTION&gt;</w:t>
-            </w:r>
-            <w:bookmarkEnd w:id="2"/>
+              <w:t>About Us Page</w:t>
+            </w:r>
           </w:p>
         </w:tc>
       </w:tr>
@@ -3224,6 +3122,16 @@
               </w:rPr>
               <w:t xml:space="preserve">: </w:t>
             </w:r>
+            <w:r>
+              <w:rPr>
+                <w:rFonts w:ascii="Arial" w:hAnsi="Arial" w:cs="Arial"/>
+                <w:b/>
+                <w:bCs/>
+                <w:sz w:val="20"/>
+                <w:szCs w:val="20"/>
+              </w:rPr>
+              <w:t>Test About Us page functionality and session display.</w:t>
+            </w:r>
           </w:p>
         </w:tc>
         <w:tc>
@@ -3240,6 +3148,8 @@
                 <w:szCs w:val="20"/>
               </w:rPr>
             </w:pPr>
+            <w:proofErr w:type="spellStart"/>
+            <w:proofErr w:type="gramStart"/>
             <w:r>
               <w:rPr>
                 <w:rFonts w:ascii="Arial" w:hAnsi="Arial" w:cs="Arial"/>
@@ -3250,6 +3160,28 @@
               </w:rPr>
               <w:t>Developer:</w:t>
             </w:r>
+            <w:r>
+              <w:rPr>
+                <w:rFonts w:ascii="Arial" w:hAnsi="Arial" w:cs="Arial"/>
+                <w:b/>
+                <w:bCs/>
+                <w:sz w:val="20"/>
+                <w:szCs w:val="20"/>
+              </w:rPr>
+              <w:t>Angela</w:t>
+            </w:r>
+            <w:proofErr w:type="spellEnd"/>
+            <w:proofErr w:type="gramEnd"/>
+            <w:r>
+              <w:rPr>
+                <w:rFonts w:ascii="Arial" w:hAnsi="Arial" w:cs="Arial"/>
+                <w:b/>
+                <w:bCs/>
+                <w:sz w:val="20"/>
+                <w:szCs w:val="20"/>
+              </w:rPr>
+              <w:t xml:space="preserve"> Vargas</w:t>
+            </w:r>
           </w:p>
           <w:p>
             <w:pPr>
@@ -3284,27 +3216,16 @@
                 <w:sz w:val="20"/>
                 <w:szCs w:val="20"/>
               </w:rPr>
-              <w:t>&lt;</w:t>
-            </w:r>
-            <w:proofErr w:type="spellStart"/>
-            <w:r>
-              <w:rPr>
-                <w:rFonts w:ascii="Arial" w:hAnsi="Arial" w:cs="Arial"/>
-                <w:color w:val="C00000"/>
-                <w:sz w:val="20"/>
-                <w:szCs w:val="20"/>
-              </w:rPr>
-              <w:t>yyyy</w:t>
-            </w:r>
-            <w:proofErr w:type="spellEnd"/>
-            <w:r>
-              <w:rPr>
-                <w:rFonts w:ascii="Arial" w:hAnsi="Arial" w:cs="Arial"/>
-                <w:color w:val="C00000"/>
-                <w:sz w:val="20"/>
-                <w:szCs w:val="20"/>
-              </w:rPr>
-              <w:t xml:space="preserve">/mm/dd&gt; </w:t>
+              <w:t>04/25/2026</w:t>
+            </w:r>
+            <w:r>
+              <w:rPr>
+                <w:rFonts w:ascii="Arial" w:hAnsi="Arial" w:cs="Arial"/>
+                <w:color w:val="C00000"/>
+                <w:sz w:val="20"/>
+                <w:szCs w:val="20"/>
+              </w:rPr>
+              <w:t xml:space="preserve"> </w:t>
             </w:r>
           </w:p>
         </w:tc>
@@ -3580,7 +3501,7 @@
                 <w:sz w:val="20"/>
                 <w:szCs w:val="20"/>
               </w:rPr>
-              <w:t>&lt;Enter an action&gt;</w:t>
+              <w:t>Navigate to About Us page</w:t>
             </w:r>
           </w:p>
         </w:tc>
@@ -3605,7 +3526,7 @@
                 <w:sz w:val="20"/>
                 <w:szCs w:val="20"/>
               </w:rPr>
-              <w:t>&lt;Enter the expected results&gt;</w:t>
+              <w:t>Page loads without errors</w:t>
             </w:r>
           </w:p>
         </w:tc>
@@ -3708,7 +3629,7 @@
                 <w:sz w:val="20"/>
                 <w:szCs w:val="20"/>
               </w:rPr>
-              <w:t>&lt;Enter an action&gt;</w:t>
+              <w:t>Verify content sections display</w:t>
             </w:r>
           </w:p>
         </w:tc>
@@ -3733,7 +3654,7 @@
                 <w:sz w:val="20"/>
                 <w:szCs w:val="20"/>
               </w:rPr>
-              <w:t>&lt;Enter the expected results&gt;</w:t>
+              <w:t>Story, mission, and team sections are visible</w:t>
             </w:r>
           </w:p>
         </w:tc>
@@ -3836,7 +3757,7 @@
                 <w:sz w:val="20"/>
                 <w:szCs w:val="20"/>
               </w:rPr>
-              <w:t>&lt;Enter an action&gt;</w:t>
+              <w:t>Log in and return to About Us page</w:t>
             </w:r>
           </w:p>
         </w:tc>
@@ -3861,7 +3782,16 @@
                 <w:sz w:val="20"/>
                 <w:szCs w:val="20"/>
               </w:rPr>
-              <w:t>&lt;Enter the expected results&gt;</w:t>
+              <w:t xml:space="preserve">Welcome message displays with </w:t>
+            </w:r>
+            <w:r>
+              <w:rPr>
+                <w:rFonts w:ascii="Arial" w:hAnsi="Arial" w:cs="Arial"/>
+                <w:color w:val="C00000"/>
+                <w:sz w:val="20"/>
+                <w:szCs w:val="20"/>
+              </w:rPr>
+              <w:t>username</w:t>
             </w:r>
           </w:p>
         </w:tc>
@@ -3964,7 +3894,7 @@
                 <w:sz w:val="20"/>
                 <w:szCs w:val="20"/>
               </w:rPr>
-              <w:t>&lt;Enter an action&gt;</w:t>
+              <w:t>Click logout button</w:t>
             </w:r>
           </w:p>
         </w:tc>
@@ -3989,7 +3919,7 @@
                 <w:sz w:val="20"/>
                 <w:szCs w:val="20"/>
               </w:rPr>
-              <w:t>&lt;Enter the expected results&gt;</w:t>
+              <w:t>User is logged out and redirected</w:t>
             </w:r>
           </w:p>
         </w:tc>
@@ -4092,7 +4022,7 @@
                 <w:sz w:val="20"/>
                 <w:szCs w:val="20"/>
               </w:rPr>
-              <w:t>&lt;Enter an action&gt;</w:t>
+              <w:t>Reload About Us page</w:t>
             </w:r>
           </w:p>
         </w:tc>
@@ -4117,7 +4047,7 @@
                 <w:sz w:val="20"/>
                 <w:szCs w:val="20"/>
               </w:rPr>
-              <w:t>&lt;Enter the expected results&gt;</w:t>
+              <w:t>Welcome message no longer appears</w:t>
             </w:r>
           </w:p>
         </w:tc>
@@ -4199,6 +4129,7 @@
                 <w:sz w:val="20"/>
                 <w:szCs w:val="20"/>
               </w:rPr>
+              <w:lastRenderedPageBreak/>
               <w:t>Comments</w:t>
             </w:r>
           </w:p>
@@ -4225,7 +4156,7 @@
                 <w:sz w:val="20"/>
                 <w:szCs w:val="20"/>
               </w:rPr>
-              <w:t>Comments should be substantive; this means there should be at least 2-3 well-structured sentences with constructive feedback.</w:t>
+              <w:t>The About Us page loads correctly and displays all expected content. Session handling works properly, showing user-specific information when logged in and removing it after logout. Navigation links function as expected, confirming that the page is fully integrated with the application.</w:t>
             </w:r>
           </w:p>
         </w:tc>
@@ -4278,15 +4209,7 @@
                 <w:sz w:val="24"/>
                 <w:szCs w:val="24"/>
               </w:rPr>
-              <w:t xml:space="preserve">Test </w:t>
-            </w:r>
-            <w:r>
-              <w:rPr>
-                <w:rFonts w:ascii="Arial" w:hAnsi="Arial" w:cs="Arial"/>
-                <w:sz w:val="24"/>
-                <w:szCs w:val="24"/>
-              </w:rPr>
-              <w:t>4</w:t>
+              <w:t>Test 4</w:t>
             </w:r>
           </w:p>
         </w:tc>
@@ -4311,7 +4234,7 @@
                 <w:bCs/>
                 <w:color w:val="auto"/>
               </w:rPr>
-              <w:t>&lt;DESCRIPTION&gt;</w:t>
+              <w:t>Reservation Summary Data Accuracy</w:t>
             </w:r>
           </w:p>
         </w:tc>
@@ -4368,6 +4291,16 @@
               </w:rPr>
               <w:t xml:space="preserve">: </w:t>
             </w:r>
+            <w:r>
+              <w:rPr>
+                <w:rFonts w:ascii="Arial" w:hAnsi="Arial" w:cs="Arial"/>
+                <w:b/>
+                <w:bCs/>
+                <w:sz w:val="20"/>
+                <w:szCs w:val="20"/>
+              </w:rPr>
+              <w:t>Test accuracy of data displayed on reservation summary page.</w:t>
+            </w:r>
           </w:p>
         </w:tc>
         <w:tc>
@@ -4384,6 +4317,8 @@
                 <w:szCs w:val="20"/>
               </w:rPr>
             </w:pPr>
+            <w:proofErr w:type="spellStart"/>
+            <w:proofErr w:type="gramStart"/>
             <w:r>
               <w:rPr>
                 <w:rFonts w:ascii="Arial" w:hAnsi="Arial" w:cs="Arial"/>
@@ -4394,6 +4329,28 @@
               </w:rPr>
               <w:t>Developer:</w:t>
             </w:r>
+            <w:r>
+              <w:rPr>
+                <w:rFonts w:ascii="Arial" w:hAnsi="Arial" w:cs="Arial"/>
+                <w:b/>
+                <w:bCs/>
+                <w:sz w:val="20"/>
+                <w:szCs w:val="20"/>
+              </w:rPr>
+              <w:t>Angela</w:t>
+            </w:r>
+            <w:proofErr w:type="spellEnd"/>
+            <w:proofErr w:type="gramEnd"/>
+            <w:r>
+              <w:rPr>
+                <w:rFonts w:ascii="Arial" w:hAnsi="Arial" w:cs="Arial"/>
+                <w:b/>
+                <w:bCs/>
+                <w:sz w:val="20"/>
+                <w:szCs w:val="20"/>
+              </w:rPr>
+              <w:t xml:space="preserve"> Vargas</w:t>
+            </w:r>
           </w:p>
           <w:p>
             <w:pPr>
@@ -4428,27 +4385,16 @@
                 <w:sz w:val="20"/>
                 <w:szCs w:val="20"/>
               </w:rPr>
-              <w:t>&lt;</w:t>
-            </w:r>
-            <w:proofErr w:type="spellStart"/>
-            <w:r>
-              <w:rPr>
-                <w:rFonts w:ascii="Arial" w:hAnsi="Arial" w:cs="Arial"/>
-                <w:color w:val="C00000"/>
-                <w:sz w:val="20"/>
-                <w:szCs w:val="20"/>
-              </w:rPr>
-              <w:t>yyyy</w:t>
-            </w:r>
-            <w:proofErr w:type="spellEnd"/>
-            <w:r>
-              <w:rPr>
-                <w:rFonts w:ascii="Arial" w:hAnsi="Arial" w:cs="Arial"/>
-                <w:color w:val="C00000"/>
-                <w:sz w:val="20"/>
-                <w:szCs w:val="20"/>
-              </w:rPr>
-              <w:t xml:space="preserve">/mm/dd&gt; </w:t>
+              <w:t>04/25/2026</w:t>
+            </w:r>
+            <w:r>
+              <w:rPr>
+                <w:rFonts w:ascii="Arial" w:hAnsi="Arial" w:cs="Arial"/>
+                <w:color w:val="C00000"/>
+                <w:sz w:val="20"/>
+                <w:szCs w:val="20"/>
+              </w:rPr>
+              <w:t xml:space="preserve"> </w:t>
             </w:r>
           </w:p>
         </w:tc>
@@ -4724,7 +4670,7 @@
                 <w:sz w:val="20"/>
                 <w:szCs w:val="20"/>
               </w:rPr>
-              <w:t>&lt;Enter an action&gt;</w:t>
+              <w:t>Create a new reservation</w:t>
             </w:r>
           </w:p>
         </w:tc>
@@ -4749,7 +4695,7 @@
                 <w:sz w:val="20"/>
                 <w:szCs w:val="20"/>
               </w:rPr>
-              <w:t>&lt;Enter the expected results&gt;</w:t>
+              <w:t>Reservation is successfully submitted</w:t>
             </w:r>
           </w:p>
         </w:tc>
@@ -4774,7 +4720,7 @@
                 <w:sz w:val="20"/>
                 <w:szCs w:val="20"/>
               </w:rPr>
-              <w:t>&lt;yes/no&gt;</w:t>
+              <w:t>Pass</w:t>
             </w:r>
           </w:p>
         </w:tc>
@@ -4852,7 +4798,7 @@
                 <w:sz w:val="20"/>
                 <w:szCs w:val="20"/>
               </w:rPr>
-              <w:t>&lt;Enter an action&gt;</w:t>
+              <w:t>Observe reservation summary page</w:t>
             </w:r>
           </w:p>
         </w:tc>
@@ -4877,7 +4823,7 @@
                 <w:sz w:val="20"/>
                 <w:szCs w:val="20"/>
               </w:rPr>
-              <w:t>&lt;Enter the expected results&gt;</w:t>
+              <w:t>Summary page displays automatically</w:t>
             </w:r>
           </w:p>
         </w:tc>
@@ -4902,7 +4848,7 @@
                 <w:sz w:val="20"/>
                 <w:szCs w:val="20"/>
               </w:rPr>
-              <w:t>&lt;yes/no&gt;</w:t>
+              <w:t>Pass</w:t>
             </w:r>
           </w:p>
         </w:tc>
@@ -4980,7 +4926,7 @@
                 <w:sz w:val="20"/>
                 <w:szCs w:val="20"/>
               </w:rPr>
-              <w:t>&lt;Enter an action&gt;</w:t>
+              <w:t>Compare input data with summary output</w:t>
             </w:r>
           </w:p>
         </w:tc>
@@ -5005,7 +4951,7 @@
                 <w:sz w:val="20"/>
                 <w:szCs w:val="20"/>
               </w:rPr>
-              <w:t>&lt;Enter the expected results&gt;</w:t>
+              <w:t>Dates, guests, and room match input</w:t>
             </w:r>
           </w:p>
         </w:tc>
@@ -5030,7 +4976,7 @@
                 <w:sz w:val="20"/>
                 <w:szCs w:val="20"/>
               </w:rPr>
-              <w:t>&lt;yes/no&gt;</w:t>
+              <w:t>Pass</w:t>
             </w:r>
           </w:p>
         </w:tc>
@@ -5108,7 +5054,7 @@
                 <w:sz w:val="20"/>
                 <w:szCs w:val="20"/>
               </w:rPr>
-              <w:t>&lt;Enter an action&gt;</w:t>
+              <w:t>Verify total cost calculation</w:t>
             </w:r>
           </w:p>
         </w:tc>
@@ -5133,7 +5079,7 @@
                 <w:sz w:val="20"/>
                 <w:szCs w:val="20"/>
               </w:rPr>
-              <w:t>&lt;Enter the expected results&gt;</w:t>
+              <w:t>Total cost reflects correct nightly rate and number of nights</w:t>
             </w:r>
           </w:p>
         </w:tc>
@@ -5158,7 +5104,7 @@
                 <w:sz w:val="20"/>
                 <w:szCs w:val="20"/>
               </w:rPr>
-              <w:t>&lt;yes/no&gt;</w:t>
+              <w:t>Pass</w:t>
             </w:r>
           </w:p>
         </w:tc>
@@ -5236,7 +5182,7 @@
                 <w:sz w:val="20"/>
                 <w:szCs w:val="20"/>
               </w:rPr>
-              <w:t>&lt;Enter an action&gt;</w:t>
+              <w:t>Verify selected attractions</w:t>
             </w:r>
           </w:p>
         </w:tc>
@@ -5261,7 +5207,7 @@
                 <w:sz w:val="20"/>
                 <w:szCs w:val="20"/>
               </w:rPr>
-              <w:t>&lt;Enter the expected results&gt;</w:t>
+              <w:t>Selected attractions display correctly or show “None selected”</w:t>
             </w:r>
           </w:p>
         </w:tc>
@@ -5286,7 +5232,7 @@
                 <w:sz w:val="20"/>
                 <w:szCs w:val="20"/>
               </w:rPr>
-              <w:t>&lt;yes/no&gt;</w:t>
+              <w:t>Pass</w:t>
             </w:r>
           </w:p>
         </w:tc>
@@ -5343,7 +5289,6 @@
                 <w:sz w:val="20"/>
                 <w:szCs w:val="20"/>
               </w:rPr>
-              <w:lastRenderedPageBreak/>
               <w:t>Comments</w:t>
             </w:r>
           </w:p>
@@ -5370,7 +5315,7 @@
                 <w:sz w:val="20"/>
                 <w:szCs w:val="20"/>
               </w:rPr>
-              <w:t>Comments should be substantive; this means there should be at least 2-3 well-structured sentences with constructive feedback.</w:t>
+              <w:t>The reservation summary page accurately reflects all user input and calculated values. Data retrieved from the database, including room information and pricing, is displayed correctly. The system ensures consistency between user input and output, confirming that backend processing is functioning properly.</w:t>
             </w:r>
           </w:p>
         </w:tc>

</xml_diff>